<commit_message>
court(ark): answering-brief gated on the shared model (fb-595.54.28)
Co-Authored-By: Claude Opus 5.5 <noreply@anthropic.com>
</commit_message>
<xml_diff>
--- a/courts/eighth-circuit/arkansas/state/supreme-court/answering-brief/usage/OUTPUT-answering-brief.docx
+++ b/courts/eighth-circuit/arkansas/state/supreme-court/answering-brief/usage/OUTPUT-answering-brief.docx
@@ -4938,7 +4938,7 @@
         <w:tab/>
       </w:r>
       <w:r>
-        <w:t xml:space="preserve">12</w:t>
+        <w:t xml:space="preserve">13</w:t>
       </w:r>
     </w:p>
     <w:p>
@@ -7939,7 +7939,7 @@
         <w:t xml:space="preserve"> </w:t>
       </w:r>
       <w:r>
-        <w:t xml:space="preserve">“to make all legislation ultimately depend on the fidelity with which a journal clerk has made his entries, is, [. . .] to render the laws as uncertain as the terms of a horse trade.”</w:t>
+        <w:t xml:space="preserve">“to make all legislation ultimately depend on the fidelity with which a journal clerk has made his entries, is, [. . .] to render the laws as uncertain as the terms of a horse trade.”</w:t>
       </w:r>
       <w:r>
         <w:t xml:space="preserve"> </w:t>
@@ -10114,6 +10114,33 @@
       <w:ind w:left="2160" w:hanging="720"/>
     </w:pPr>
   </w:style>
+  <w:style w:type="paragraph" w:customStyle="1" w:styleId="XdQuoteList1">
+    <w:name w:val="Xd Quote List 1"/>
+    <w:basedOn w:val="Normal"/>
+    <w:qFormat/>
+    <w:pPr>
+      <w:spacing w:before="0" w:after="0" w:line="322" w:lineRule="exact"/>
+      <w:ind w:left="1440" w:right="720" w:hanging="720"/>
+    </w:pPr>
+  </w:style>
+  <w:style w:type="paragraph" w:customStyle="1" w:styleId="XdQuoteList2">
+    <w:name w:val="Xd Quote List 2"/>
+    <w:basedOn w:val="Normal"/>
+    <w:qFormat/>
+    <w:pPr>
+      <w:spacing w:before="0" w:after="0" w:line="322" w:lineRule="exact"/>
+      <w:ind w:left="2160" w:right="720" w:hanging="720"/>
+    </w:pPr>
+  </w:style>
+  <w:style w:type="paragraph" w:customStyle="1" w:styleId="XdQuoteList3">
+    <w:name w:val="Xd Quote List 3"/>
+    <w:basedOn w:val="Normal"/>
+    <w:qFormat/>
+    <w:pPr>
+      <w:spacing w:before="0" w:after="0" w:line="322" w:lineRule="exact"/>
+      <w:ind w:left="2880" w:right="720" w:hanging="720"/>
+    </w:pPr>
+  </w:style>
   <w:style w:type="paragraph" w:customStyle="1" w:styleId="XdQuoteOnly">
     <w:name w:val="XdQuoteOnly"/>
     <w:basedOn w:val="BodyText"/>

</xml_diff>